<commit_message>
docs: complete section 6 command purpose notes and fill screenshots for sections 7 and 8
Agent-Logs-Url: https://github.com/zjxyun/network/sessions/5cf8fd25-a55a-44d9-9479-7359f54b7746

Co-authored-by: zjxyun <153380537+zjxyun@users.noreply.github.com>
</commit_message>
<xml_diff>
--- a/实验4扩展--基于OpenSSL的PKI证书体系搭建与通信加密实现课程设计报告（命令截图详版）.docx
+++ b/实验4扩展--基于OpenSSL的PKI证书体系搭建与通信加密实现课程设计报告（命令截图详版）.docx
@@ -7,45 +7,22 @@
         <w:rPr>
           <w:b/>
         </w:rPr>
-        <w:t>计算机与人工智能学院</w:t>
+        <w:t>（网络与信息安全）实验报告书</w:t>
       </w:r>
     </w:p>
     <w:p>
       <w:r>
-        <w:t>网络空间安全（GS24805002）</w:t>
+        <w:t>实验题目：实验4 基于 OpenSSL 的 PKI 构建实验（扩展）</w:t>
       </w:r>
     </w:p>
     <w:p>
       <w:r>
-        <w:t>课程设计报告</w:t>
+        <w:t>实验材料：课程设计报告（含命令+截图+解释）</w:t>
       </w:r>
     </w:p>
     <w:p>
       <w:r>
-        <w:rPr>
-          <w:b/>
-        </w:rPr>
-        <w:t>题目：实验4扩展——基于OpenSSL的PKI证书体系搭建与通信加密实现</w:t>
-      </w:r>
-    </w:p>
-    <w:p>
-      <w:r>
-        <w:t>班级：网络空间安全</w:t>
-      </w:r>
-    </w:p>
-    <w:p>
-      <w:r>
-        <w:t>姓名：________    学号：________</w:t>
-      </w:r>
-    </w:p>
-    <w:p>
-      <w:r>
-        <w:t>日期：2026年5月</w:t>
-      </w:r>
-    </w:p>
-    <w:p>
-      <w:r>
-        <w:br w:type="page"/>
+        <w:t>班级：网络空间安全    姓名：________    学号：________</w:t>
       </w:r>
     </w:p>
     <w:p>
@@ -58,7 +35,7 @@
     </w:p>
     <w:p>
       <w:r>
-        <w:t>基于 OpenSSL 完成根CA、二级CA、服务器证书签发，构建完整信任链；实现 TLS 加密通信、文件加解密与数字签名验签；结合实验现象完成安全风险分析。</w:t>
+        <w:t>完成 Root CA、Sub CA、服务器证书签发，建立证书链；完成 TLS 加密通信验证；完成文件加解密、签名与验签；分析典型风险与防护策略。</w:t>
       </w:r>
     </w:p>
     <w:p>
@@ -71,7 +48,7 @@
     </w:p>
     <w:p>
       <w:r>
-        <w:t>掌握 PKI 架构与证书链原理，具备证书签发、HTTPS 加密部署、完整性校验与安全排障能力。</w:t>
+        <w:t>理解 PKI 信任体系与 TLS 认证流程，掌握 OpenSSL 证书签发、验证、排障和安全加固方法。</w:t>
       </w:r>
     </w:p>
     <w:p>
@@ -79,12 +56,12 @@
         <w:pStyle w:val="Heading1"/>
       </w:pPr>
       <w:r>
-        <w:t>三、课程设计背景与意义</w:t>
+        <w:t>三、实验环境与工具</w:t>
       </w:r>
     </w:p>
     <w:p>
       <w:r>
-        <w:t>在明文传输场景中，数据容易被窃听或篡改。通过自建 PKI 与 TLS，可实现身份认证、机密性与完整性保障，贴近企业内网证书体系实践。</w:t>
+        <w:t>系统：Linux；工具：OpenSSL 3.x；测试方式：命令行验证 + 结果截图。</w:t>
       </w:r>
     </w:p>
     <w:p>
@@ -92,12 +69,12 @@
         <w:pStyle w:val="Heading1"/>
       </w:pPr>
       <w:r>
-        <w:t>四、相关理论技术基础</w:t>
+        <w:t>四、总体设计方案</w:t>
       </w:r>
     </w:p>
     <w:p>
       <w:r>
-        <w:t>涉及 RSA 非对称密码、X.509 证书、CA 信任链、TLS 握手、数字签名与验签机制。</w:t>
+        <w:t>采用两级 CA 架构：Root CA（离线）→ Sub CA（在线签发）→ Server Cert（业务证书），并通过客户端校验链路可信性。</w:t>
       </w:r>
     </w:p>
     <w:p>
@@ -105,12 +82,12 @@
         <w:pStyle w:val="Heading1"/>
       </w:pPr>
       <w:r>
-        <w:t>五、总体设计方案</w:t>
+        <w:t>五、理论基础</w:t>
       </w:r>
     </w:p>
     <w:p>
       <w:r>
-        <w:t>采用两级 CA 架构：Root CA（离线）→ Sub CA（在线签发）→ Server Cert（业务证书）。完成证书链验证、TLS 连接测试、签名与防篡改验证。</w:t>
+        <w:t>基于 RSA 非对称加密、X.509 数字证书、证书链验证、TLS 握手与数字签名完整性校验机制。</w:t>
       </w:r>
     </w:p>
     <w:p>
@@ -118,7 +95,7 @@
         <w:pStyle w:val="Heading1"/>
       </w:pPr>
       <w:r>
-        <w:t>六、详细设计与核心实现步骤（命令+截图+解释）</w:t>
+        <w:t>六、详细设计与核心实现步骤（逐条命令作用说明）</w:t>
       </w:r>
     </w:p>
     <w:p>
@@ -126,7 +103,7 @@
         <w:pStyle w:val="Heading2"/>
       </w:pPr>
       <w:r>
-        <w:t>6.1 PKI 目录与配置初始化</w:t>
+        <w:t>6.1 目录与证书扩展配置初始化</w:t>
       </w:r>
     </w:p>
     <w:p>
@@ -140,11 +117,21 @@
     </w:p>
     <w:p>
       <w:r>
+        <w:t>命令作用：创建根CA、二级CA、服务器三层目录，隔离密钥与证书文件，避免误用。</w:t>
+      </w:r>
+    </w:p>
+    <w:p>
+      <w:r>
         <w:rPr>
           <w:rFonts w:ascii="Consolas" w:hAnsi="Consolas" w:eastAsia="Consolas"/>
           <w:sz w:val="20"/>
         </w:rPr>
         <w:t>cat &gt; pki/subca/subca_ext.cnf &lt;&lt;EOF ... EOF</w:t>
+      </w:r>
+    </w:p>
+    <w:p>
+      <w:r>
+        <w:t>命令作用：定义二级CA扩展（CA:TRUE、keyCertSign、cRLSign），保证其具备合法下级签发能力。</w:t>
       </w:r>
     </w:p>
     <w:p>
@@ -158,7 +145,7 @@
     </w:p>
     <w:p>
       <w:r>
-        <w:t>解释：按 rootca/subca/server 分目录，避免密钥与证书混放；通过 ext 配置明确 CA 权限、服务器 SAN（localhost/127.0.0.1）。</w:t>
+        <w:t>命令作用：定义服务器证书扩展（CA:FALSE、serverAuth、SAN=localhost/127.0.0.1），保证 TLS 场景可被正确校验。</w:t>
       </w:r>
     </w:p>
     <w:p>
@@ -166,7 +153,7 @@
         <w:pStyle w:val="Heading2"/>
       </w:pPr>
       <w:r>
-        <w:t>6.2 生成根 CA 私钥与根证书</w:t>
+        <w:t>6.2 Root CA 生成</w:t>
       </w:r>
     </w:p>
     <w:p>
@@ -180,11 +167,7 @@
     </w:p>
     <w:p>
       <w:r>
-        <w:rPr>
-          <w:rFonts w:ascii="Consolas" w:hAnsi="Consolas" w:eastAsia="Consolas"/>
-          <w:sz w:val="20"/>
-        </w:rPr>
-        <w:t>openssl req -new -x509 -days 3650 -key pki/rootca/rootca.key.pem -passin pass:RootCA@2026 -out pki/rootca/rootca.cert.pem -subj /C=CN/.../CN=ZJXYUN-Root-CA</w:t>
+        <w:t>命令作用：生成 Root CA 私钥并使用 AES-256 口令保护，防止私钥明文泄露。</w:t>
       </w:r>
     </w:p>
     <w:p>
@@ -225,7 +208,21 @@
     </w:p>
     <w:p>
       <w:r>
-        <w:t>图6-1 生成 Root CA 私钥命令输出截图</w:t>
+        <w:t>图6-1 生成 Root CA 私钥</w:t>
+      </w:r>
+    </w:p>
+    <w:p>
+      <w:r>
+        <w:rPr>
+          <w:rFonts w:ascii="Consolas" w:hAnsi="Consolas" w:eastAsia="Consolas"/>
+          <w:sz w:val="20"/>
+        </w:rPr>
+        <w:t>openssl req -new -x509 -days 3650 -key pki/rootca/rootca.key.pem -passin pass:RootCA@2026 -out pki/rootca/rootca.cert.pem -subj /C=CN/ST=Zhejiang/L=Hangzhou/O=ZJXYUN/OU=NetworkSec/CN=ZJXYUN-Root-CA</w:t>
+      </w:r>
+    </w:p>
+    <w:p>
+      <w:r>
+        <w:t>命令作用：基于 Root 私钥自签发根证书，作为整个 PKI 信任锚。</w:t>
       </w:r>
     </w:p>
     <w:p>
@@ -266,12 +263,7 @@
     </w:p>
     <w:p>
       <w:r>
-        <w:t>图6-2 生成 Root CA 自签名证书截图</w:t>
-      </w:r>
-    </w:p>
-    <w:p>
-      <w:r>
-        <w:t>解释：Root CA 私钥采用 AES256 口令保护并离线保存；根证书作为信任锚，有效期设置较长。</w:t>
+        <w:t>图6-2 生成 Root CA 自签证书</w:t>
       </w:r>
     </w:p>
     <w:p>
@@ -279,7 +271,7 @@
         <w:pStyle w:val="Heading2"/>
       </w:pPr>
       <w:r>
-        <w:t>6.3 生成二级 CA 并由根 CA 签发</w:t>
+        <w:t>6.3 Sub CA 生成与签发</w:t>
       </w:r>
     </w:p>
     <w:p>
@@ -293,11 +285,21 @@
     </w:p>
     <w:p>
       <w:r>
+        <w:t>命令作用：生成二级 CA 私钥，用于后续签发服务器证书。</w:t>
+      </w:r>
+    </w:p>
+    <w:p>
+      <w:r>
         <w:rPr>
           <w:rFonts w:ascii="Consolas" w:hAnsi="Consolas" w:eastAsia="Consolas"/>
           <w:sz w:val="20"/>
         </w:rPr>
-        <w:t>openssl req -new -key pki/subca/subca.key.pem -out pki/subca/subca.csr.pem -subj /C=CN/.../CN=ZJXYUN-Sub-CA</w:t>
+        <w:t>openssl req -new -key pki/subca/subca.key.pem -out pki/subca/subca.csr.pem -subj /C=CN/ST=Zhejiang/L=Hangzhou/O=ZJXYUN/OU=NetworkSec/CN=ZJXYUN-Sub-CA</w:t>
+      </w:r>
+    </w:p>
+    <w:p>
+      <w:r>
+        <w:t>命令作用：生成二级 CA 的 CSR 请求文件，提交给 Root CA 审核签发。</w:t>
       </w:r>
     </w:p>
     <w:p>
@@ -307,6 +309,11 @@
           <w:sz w:val="20"/>
         </w:rPr>
         <w:t>openssl x509 -req -days 1825 -in pki/subca/subca.csr.pem -CA pki/rootca/rootca.cert.pem -CAkey pki/rootca/rootca.key.pem -passin pass:RootCA@2026 -CAcreateserial -out pki/subca/subca.cert.pem -extfile pki/subca/subca_ext.cnf</w:t>
+      </w:r>
+    </w:p>
+    <w:p>
+      <w:r>
+        <w:t>命令作用：Root CA 对 Sub CA 完成签发，建立上级信任关系并附加 CA 扩展权限。</w:t>
       </w:r>
     </w:p>
     <w:p>
@@ -347,12 +354,7 @@
     </w:p>
     <w:p>
       <w:r>
-        <w:t>图6-3 Root CA 签发 Sub CA 证书截图</w:t>
-      </w:r>
-    </w:p>
-    <w:p>
-      <w:r>
-        <w:t>解释：Sub CA 使用独立密钥并通过 Root CA 签发，形成上级信任关系；扩展项中 CA:TRUE 表明可继续签发下级证书。</w:t>
+        <w:t>图6-3 Root CA 签发 Sub CA 证书</w:t>
       </w:r>
     </w:p>
     <w:p>
@@ -360,7 +362,7 @@
         <w:pStyle w:val="Heading2"/>
       </w:pPr>
       <w:r>
-        <w:t>6.4 服务器证书签发与证书链组装</w:t>
+        <w:t>6.4 服务器证书签发与证书链验证</w:t>
       </w:r>
     </w:p>
     <w:p>
@@ -374,11 +376,21 @@
     </w:p>
     <w:p>
       <w:r>
+        <w:t>命令作用：生成服务器私钥，用于 TLS 握手和解密会话密钥。</w:t>
+      </w:r>
+    </w:p>
+    <w:p>
+      <w:r>
         <w:rPr>
           <w:rFonts w:ascii="Consolas" w:hAnsi="Consolas" w:eastAsia="Consolas"/>
           <w:sz w:val="20"/>
         </w:rPr>
-        <w:t>openssl req -new -key pki/server/server.key.pem -out pki/server/server.csr.pem -subj /C=CN/.../CN=localhost</w:t>
+        <w:t>openssl req -new -key pki/server/server.key.pem -out pki/server/server.csr.pem -subj /C=CN/ST=Zhejiang/L=Hangzhou/O=ZJXYUN/OU=NetworkSec/CN=localhost</w:t>
+      </w:r>
+    </w:p>
+    <w:p>
+      <w:r>
+        <w:t>命令作用：生成服务器 CSR，请求 Sub CA 签发业务证书。</w:t>
       </w:r>
     </w:p>
     <w:p>
@@ -392,20 +404,7 @@
     </w:p>
     <w:p>
       <w:r>
-        <w:rPr>
-          <w:rFonts w:ascii="Consolas" w:hAnsi="Consolas" w:eastAsia="Consolas"/>
-          <w:sz w:val="20"/>
-        </w:rPr>
-        <w:t>cat pki/subca/subca.cert.pem pki/rootca/rootca.cert.pem &gt; pki/server/chain.pem</w:t>
-      </w:r>
-    </w:p>
-    <w:p>
-      <w:r>
-        <w:rPr>
-          <w:rFonts w:ascii="Consolas" w:hAnsi="Consolas" w:eastAsia="Consolas"/>
-          <w:sz w:val="20"/>
-        </w:rPr>
-        <w:t>openssl verify -CAfile pki/rootca/rootca.cert.pem -untrusted pki/subca/subca.cert.pem pki/server/server.cert.pem</w:t>
+        <w:t>命令作用：由 Sub CA 签发服务器证书，得到可用于 HTTPS/TLS 的终端实体证书。</w:t>
       </w:r>
     </w:p>
     <w:p>
@@ -446,7 +445,35 @@
     </w:p>
     <w:p>
       <w:r>
-        <w:t>图6-4 签发服务器证书截图</w:t>
+        <w:t>图6-4 签发服务器证书</w:t>
+      </w:r>
+    </w:p>
+    <w:p>
+      <w:r>
+        <w:rPr>
+          <w:rFonts w:ascii="Consolas" w:hAnsi="Consolas" w:eastAsia="Consolas"/>
+          <w:sz w:val="20"/>
+        </w:rPr>
+        <w:t>cat pki/subca/subca.cert.pem pki/rootca/rootca.cert.pem &gt; pki/server/chain.pem</w:t>
+      </w:r>
+    </w:p>
+    <w:p>
+      <w:r>
+        <w:t>命令作用：组装中间证书+根证书链，供服务端在握手时返回完整链路。</w:t>
+      </w:r>
+    </w:p>
+    <w:p>
+      <w:r>
+        <w:rPr>
+          <w:rFonts w:ascii="Consolas" w:hAnsi="Consolas" w:eastAsia="Consolas"/>
+          <w:sz w:val="20"/>
+        </w:rPr>
+        <w:t>openssl verify -CAfile pki/rootca/rootca.cert.pem -untrusted pki/subca/subca.cert.pem pki/server/server.cert.pem</w:t>
+      </w:r>
+    </w:p>
+    <w:p>
+      <w:r>
+        <w:t>命令作用：离线验证服务器证书链是否可追溯到受信任 Root CA。</w:t>
       </w:r>
     </w:p>
     <w:p>
@@ -487,12 +514,7 @@
     </w:p>
     <w:p>
       <w:r>
-        <w:t>图6-5 证书链验证截图（server.cert.pem: OK）</w:t>
-      </w:r>
-    </w:p>
-    <w:p>
-      <w:r>
-        <w:t>解释：服务器证书设置 SAN=localhost/127.0.0.1，避免主机名校验失败；verify 返回 OK 说明链路可信。</w:t>
+        <w:t>图6-5 证书链校验结果（OK）</w:t>
       </w:r>
     </w:p>
     <w:p>
@@ -500,7 +522,7 @@
         <w:pStyle w:val="Heading2"/>
       </w:pPr>
       <w:r>
-        <w:t>6.5 TLS 握手验证与加密链路确认</w:t>
+        <w:t>6.5 TLS 加密通信验证</w:t>
       </w:r>
     </w:p>
     <w:p>
@@ -514,6 +536,11 @@
     </w:p>
     <w:p>
       <w:r>
+        <w:t>命令作用：启动本地 TLS 服务端并附带证书链，模拟 HTTPS 服务。</w:t>
+      </w:r>
+    </w:p>
+    <w:p>
+      <w:r>
         <w:rPr>
           <w:rFonts w:ascii="Consolas" w:hAnsi="Consolas" w:eastAsia="Consolas"/>
           <w:sz w:val="20"/>
@@ -523,9 +550,14 @@
     </w:p>
     <w:p>
       <w:r>
+        <w:t>命令作用：客户端验证证书链和主机名，确认握手通过且证书可信。</w:t>
+      </w:r>
+    </w:p>
+    <w:p>
+      <w:r>
         <w:drawing>
           <wp:inline xmlns:a="http://schemas.openxmlformats.org/drawingml/2006/main" xmlns:pic="http://schemas.openxmlformats.org/drawingml/2006/picture">
-            <wp:extent cx="5669280" cy="4037215"/>
+            <wp:extent cx="5669280" cy="4209011"/>
             <wp:docPr id="6" name="Picture 6"/>
             <wp:cNvGraphicFramePr>
               <a:graphicFrameLocks noChangeAspect="1"/>
@@ -546,7 +578,7 @@
                   <pic:spPr>
                     <a:xfrm>
                       <a:off x="0" y="0"/>
-                      <a:ext cx="5669280" cy="4037215"/>
+                      <a:ext cx="5669280" cy="4209011"/>
                     </a:xfrm>
                     <a:prstGeom prst="rect"/>
                   </pic:spPr>
@@ -559,12 +591,7 @@
     </w:p>
     <w:p>
       <w:r>
-        <w:t>图6-6 TLS 握手成功截图（Verify return code: 0）</w:t>
-      </w:r>
-    </w:p>
-    <w:p>
-      <w:r>
-        <w:t>解释：s_server 模拟 HTTPS 服务端，s_client 作为客户端校验证书链与主机名；返回码 0 代表握手和信任校验均通过。</w:t>
+        <w:t>图6-6 TLS 握手验证（Verify return code: 0）</w:t>
       </w:r>
     </w:p>
     <w:p>
@@ -586,11 +613,21 @@
     </w:p>
     <w:p>
       <w:r>
+        <w:t>命令作用：从服务器证书中导出公钥，供加密和验签使用。</w:t>
+      </w:r>
+    </w:p>
+    <w:p>
+      <w:r>
         <w:rPr>
           <w:rFonts w:ascii="Consolas" w:hAnsi="Consolas" w:eastAsia="Consolas"/>
           <w:sz w:val="20"/>
         </w:rPr>
         <w:t>openssl pkeyutl -encrypt -pubin -inkey pki/server/server.pubkey.pem -in pki/server/message.txt -out pki/server/message.enc</w:t>
+      </w:r>
+    </w:p>
+    <w:p>
+      <w:r>
+        <w:t>命令作用：使用公钥加密明文文件，验证机密性链路。</w:t>
       </w:r>
     </w:p>
     <w:p>
@@ -604,11 +641,21 @@
     </w:p>
     <w:p>
       <w:r>
+        <w:t>命令作用：使用私钥解密密文文件，验证密钥对匹配与可恢复性。</w:t>
+      </w:r>
+    </w:p>
+    <w:p>
+      <w:r>
         <w:rPr>
           <w:rFonts w:ascii="Consolas" w:hAnsi="Consolas" w:eastAsia="Consolas"/>
           <w:sz w:val="20"/>
         </w:rPr>
         <w:t>openssl dgst -sha256 -sign pki/server/server.key.pem -out pki/server/message.sig pki/server/message.txt</w:t>
+      </w:r>
+    </w:p>
+    <w:p>
+      <w:r>
+        <w:t>命令作用：使用私钥对文件计算并生成数字签名。</w:t>
       </w:r>
     </w:p>
     <w:p>
@@ -622,11 +669,7 @@
     </w:p>
     <w:p>
       <w:r>
-        <w:rPr>
-          <w:rFonts w:ascii="Consolas" w:hAnsi="Consolas" w:eastAsia="Consolas"/>
-          <w:sz w:val="20"/>
-        </w:rPr>
-        <w:t>openssl dgst -sha256 -verify pki/server/server.pubkey.pem -signature pki/server/message.sig pki/server/message_tampered.txt</w:t>
+        <w:t>命令作用：对原文验签，验证签名有效性。</w:t>
       </w:r>
     </w:p>
     <w:p>
@@ -667,7 +710,21 @@
     </w:p>
     <w:p>
       <w:r>
-        <w:t>图6-7 原文验签成功截图（Verified OK）</w:t>
+        <w:t>图6-7 原文验签成功（Verified OK）</w:t>
+      </w:r>
+    </w:p>
+    <w:p>
+      <w:r>
+        <w:rPr>
+          <w:rFonts w:ascii="Consolas" w:hAnsi="Consolas" w:eastAsia="Consolas"/>
+          <w:sz w:val="20"/>
+        </w:rPr>
+        <w:t>openssl dgst -sha256 -verify pki/server/server.pubkey.pem -signature pki/server/message.sig pki/server/message_tampered.txt</w:t>
+      </w:r>
+    </w:p>
+    <w:p>
+      <w:r>
+        <w:t>命令作用：对篡改文件验签，验证完整性破坏后会失败。</w:t>
       </w:r>
     </w:p>
     <w:p>
@@ -708,12 +765,7 @@
     </w:p>
     <w:p>
       <w:r>
-        <w:t>图6-8 篡改后验签失败截图（Verification failure）</w:t>
-      </w:r>
-    </w:p>
-    <w:p>
-      <w:r>
-        <w:t>解释：公钥加密/私钥解密保证机密性；私钥签名/公钥验签保证完整性与不可抵赖性。篡改后验签失败符合预期。</w:t>
+        <w:t>图6-8 篡改后验签失败（Verification failure）</w:t>
       </w:r>
     </w:p>
     <w:p>
@@ -721,10 +773,13 @@
         <w:pStyle w:val="Heading1"/>
       </w:pPr>
       <w:r>
-        <w:t>七、关键测试结果与现象说明（命令+截图+解释）</w:t>
+        <w:t>七、关键测试结果与现象说明（补齐截图）</w:t>
       </w:r>
     </w:p>
     <w:p>
+      <w:pPr>
+        <w:pStyle w:val="Heading2"/>
+      </w:pPr>
       <w:r>
         <w:t>测试1：证书链验证</w:t>
       </w:r>
@@ -740,59 +795,7 @@
     </w:p>
     <w:p>
       <w:r>
-        <w:t>现象：输出“server.cert.pem: OK”。说明服务证书可追溯到 Root CA，链路正确。</w:t>
-      </w:r>
-    </w:p>
-    <w:p>
-      <w:r>
-        <w:t>测试2：TLS 握手与主机名校验</w:t>
-      </w:r>
-    </w:p>
-    <w:p>
-      <w:r>
-        <w:rPr>
-          <w:rFonts w:ascii="Consolas" w:hAnsi="Consolas" w:eastAsia="Consolas"/>
-          <w:sz w:val="20"/>
-        </w:rPr>
-        <w:t>openssl s_client -connect 127.0.0.1:9443 -CAfile pki/rootca/rootca.cert.pem -verify_return_error -verify_hostname localhost</w:t>
-      </w:r>
-    </w:p>
-    <w:p>
-      <w:r>
-        <w:t>现象：日志出现 “Verification: OK”“Verify return code: 0 (ok)”。说明链路已加密且证书身份校验通过。</w:t>
-      </w:r>
-    </w:p>
-    <w:p>
-      <w:r>
-        <w:t>测试3：签名验签与防篡改</w:t>
-      </w:r>
-    </w:p>
-    <w:p>
-      <w:r>
-        <w:rPr>
-          <w:rFonts w:ascii="Consolas" w:hAnsi="Consolas" w:eastAsia="Consolas"/>
-          <w:sz w:val="20"/>
-        </w:rPr>
-        <w:t>openssl dgst -sha256 -verify pki/server/server.pubkey.pem -signature pki/server/message.sig pki/server/message_tampered.txt</w:t>
-      </w:r>
-    </w:p>
-    <w:p>
-      <w:r>
-        <w:t>现象：返回 “Verification failure” 及 RSA bad signature。说明签名能有效检测篡改。</w:t>
-      </w:r>
-    </w:p>
-    <w:p>
-      <w:r>
-        <w:t>测试4：证书有效期检查</w:t>
-      </w:r>
-    </w:p>
-    <w:p>
-      <w:r>
-        <w:rPr>
-          <w:rFonts w:ascii="Consolas" w:hAnsi="Consolas" w:eastAsia="Consolas"/>
-          <w:sz w:val="20"/>
-        </w:rPr>
-        <w:t>openssl x509 -checkend 2592000 -noout -in pki/server/server.cert.pem</w:t>
+        <w:t>命令作用：检查服务器证书链能否由 Root CA 正确验证。</w:t>
       </w:r>
     </w:p>
     <w:p>
@@ -808,7 +811,7 @@
               <a:graphicData uri="http://schemas.openxmlformats.org/drawingml/2006/picture">
                 <pic:pic>
                   <pic:nvPicPr>
-                    <pic:cNvPr id="0" name="shot_09_checkend.png"/>
+                    <pic:cNvPr id="0" name="shot_10_test_chain.png"/>
                     <pic:cNvPicPr/>
                   </pic:nvPicPr>
                   <pic:blipFill>
@@ -833,12 +836,216 @@
     </w:p>
     <w:p>
       <w:r>
-        <w:t>图7-1 证书有效期检查截图（Certificate will not expire）</w:t>
+        <w:t>图7-1 证书链验证结果：server.cert.pem: OK</w:t>
       </w:r>
     </w:p>
     <w:p>
       <w:r>
-        <w:t>现象：提示“Certificate will not expire”，表示 30 天内证书不会过期，可满足近期业务使用。</w:t>
+        <w:t>现象说明：输出 OK，说明服务器证书、中间 CA、根 CA 关系正确。</w:t>
+      </w:r>
+    </w:p>
+    <w:p>
+      <w:pPr>
+        <w:pStyle w:val="Heading2"/>
+      </w:pPr>
+      <w:r>
+        <w:t>测试2：TLS 握手与主机名校验</w:t>
+      </w:r>
+    </w:p>
+    <w:p>
+      <w:r>
+        <w:rPr>
+          <w:rFonts w:ascii="Consolas" w:hAnsi="Consolas" w:eastAsia="Consolas"/>
+          <w:sz w:val="20"/>
+        </w:rPr>
+        <w:t>openssl s_client -connect 127.0.0.1:9443 -CAfile pki/rootca/rootca.cert.pem -verify_return_error -verify_hostname localhost</w:t>
+      </w:r>
+    </w:p>
+    <w:p>
+      <w:r>
+        <w:t>命令作用：同时验证证书链可信性与主机名匹配性。</w:t>
+      </w:r>
+    </w:p>
+    <w:p>
+      <w:r>
+        <w:drawing>
+          <wp:inline xmlns:a="http://schemas.openxmlformats.org/drawingml/2006/main" xmlns:pic="http://schemas.openxmlformats.org/drawingml/2006/picture">
+            <wp:extent cx="5669280" cy="4209011"/>
+            <wp:docPr id="10" name="Picture 10"/>
+            <wp:cNvGraphicFramePr>
+              <a:graphicFrameLocks noChangeAspect="1"/>
+            </wp:cNvGraphicFramePr>
+            <a:graphic>
+              <a:graphicData uri="http://schemas.openxmlformats.org/drawingml/2006/picture">
+                <pic:pic>
+                  <pic:nvPicPr>
+                    <pic:cNvPr id="0" name="shot_11_test_tls_ok.png"/>
+                    <pic:cNvPicPr/>
+                  </pic:nvPicPr>
+                  <pic:blipFill>
+                    <a:blip r:embed="rId18"/>
+                    <a:stretch>
+                      <a:fillRect/>
+                    </a:stretch>
+                  </pic:blipFill>
+                  <pic:spPr>
+                    <a:xfrm>
+                      <a:off x="0" y="0"/>
+                      <a:ext cx="5669280" cy="4209011"/>
+                    </a:xfrm>
+                    <a:prstGeom prst="rect"/>
+                  </pic:spPr>
+                </pic:pic>
+              </a:graphicData>
+            </a:graphic>
+          </wp:inline>
+        </w:drawing>
+      </w:r>
+    </w:p>
+    <w:p>
+      <w:r>
+        <w:t>图7-2 TLS 握手结果：Verification OK, Verify return code: 0</w:t>
+      </w:r>
+    </w:p>
+    <w:p>
+      <w:r>
+        <w:t>现象说明：握手成功，表示通信链路已加密且服务端身份通过校验。</w:t>
+      </w:r>
+    </w:p>
+    <w:p>
+      <w:pPr>
+        <w:pStyle w:val="Heading2"/>
+      </w:pPr>
+      <w:r>
+        <w:t>测试3：篡改检测（验签失败）</w:t>
+      </w:r>
+    </w:p>
+    <w:p>
+      <w:r>
+        <w:rPr>
+          <w:rFonts w:ascii="Consolas" w:hAnsi="Consolas" w:eastAsia="Consolas"/>
+          <w:sz w:val="20"/>
+        </w:rPr>
+        <w:t>openssl dgst -sha256 -verify pki/server/server.pubkey.pem -signature pki/server/message.sig pki/server/message_tampered.txt</w:t>
+      </w:r>
+    </w:p>
+    <w:p>
+      <w:r>
+        <w:t>命令作用：验证签名机制是否能识别数据被修改。</w:t>
+      </w:r>
+    </w:p>
+    <w:p>
+      <w:r>
+        <w:drawing>
+          <wp:inline xmlns:a="http://schemas.openxmlformats.org/drawingml/2006/main" xmlns:pic="http://schemas.openxmlformats.org/drawingml/2006/picture">
+            <wp:extent cx="5669280" cy="773084"/>
+            <wp:docPr id="11" name="Picture 11"/>
+            <wp:cNvGraphicFramePr>
+              <a:graphicFrameLocks noChangeAspect="1"/>
+            </wp:cNvGraphicFramePr>
+            <a:graphic>
+              <a:graphicData uri="http://schemas.openxmlformats.org/drawingml/2006/picture">
+                <pic:pic>
+                  <pic:nvPicPr>
+                    <pic:cNvPr id="0" name="shot_12_test_tamper_fail.png"/>
+                    <pic:cNvPicPr/>
+                  </pic:nvPicPr>
+                  <pic:blipFill>
+                    <a:blip r:embed="rId19"/>
+                    <a:stretch>
+                      <a:fillRect/>
+                    </a:stretch>
+                  </pic:blipFill>
+                  <pic:spPr>
+                    <a:xfrm>
+                      <a:off x="0" y="0"/>
+                      <a:ext cx="5669280" cy="773084"/>
+                    </a:xfrm>
+                    <a:prstGeom prst="rect"/>
+                  </pic:spPr>
+                </pic:pic>
+              </a:graphicData>
+            </a:graphic>
+          </wp:inline>
+        </w:drawing>
+      </w:r>
+    </w:p>
+    <w:p>
+      <w:r>
+        <w:t>图7-3 篡改后验签失败：Verification failure</w:t>
+      </w:r>
+    </w:p>
+    <w:p>
+      <w:r>
+        <w:t>现象说明：出现 bad signature，说明文件完整性已被破坏。</w:t>
+      </w:r>
+    </w:p>
+    <w:p>
+      <w:pPr>
+        <w:pStyle w:val="Heading2"/>
+      </w:pPr>
+      <w:r>
+        <w:t>测试4：证书有效期巡检</w:t>
+      </w:r>
+    </w:p>
+    <w:p>
+      <w:r>
+        <w:rPr>
+          <w:rFonts w:ascii="Consolas" w:hAnsi="Consolas" w:eastAsia="Consolas"/>
+          <w:sz w:val="20"/>
+        </w:rPr>
+        <w:t>openssl x509 -checkend 2592000 -noout -in pki/server/server.cert.pem</w:t>
+      </w:r>
+    </w:p>
+    <w:p>
+      <w:r>
+        <w:t>命令作用：检测证书在未来 30 天内是否到期。</w:t>
+      </w:r>
+    </w:p>
+    <w:p>
+      <w:r>
+        <w:drawing>
+          <wp:inline xmlns:a="http://schemas.openxmlformats.org/drawingml/2006/main" xmlns:pic="http://schemas.openxmlformats.org/drawingml/2006/picture">
+            <wp:extent cx="5669280" cy="601287"/>
+            <wp:docPr id="12" name="Picture 12"/>
+            <wp:cNvGraphicFramePr>
+              <a:graphicFrameLocks noChangeAspect="1"/>
+            </wp:cNvGraphicFramePr>
+            <a:graphic>
+              <a:graphicData uri="http://schemas.openxmlformats.org/drawingml/2006/picture">
+                <pic:pic>
+                  <pic:nvPicPr>
+                    <pic:cNvPr id="0" name="shot_13_test_checkend.png"/>
+                    <pic:cNvPicPr/>
+                  </pic:nvPicPr>
+                  <pic:blipFill>
+                    <a:blip r:embed="rId20"/>
+                    <a:stretch>
+                      <a:fillRect/>
+                    </a:stretch>
+                  </pic:blipFill>
+                  <pic:spPr>
+                    <a:xfrm>
+                      <a:off x="0" y="0"/>
+                      <a:ext cx="5669280" cy="601287"/>
+                    </a:xfrm>
+                    <a:prstGeom prst="rect"/>
+                  </pic:spPr>
+                </pic:pic>
+              </a:graphicData>
+            </a:graphic>
+          </wp:inline>
+        </w:drawing>
+      </w:r>
+    </w:p>
+    <w:p>
+      <w:r>
+        <w:t>图7-4 有效期检查：Certificate will not expire</w:t>
+      </w:r>
+    </w:p>
+    <w:p>
+      <w:r>
+        <w:t>现象说明：当前证书在 30 天窗口内有效，可继续使用。</w:t>
       </w:r>
     </w:p>
     <w:p>
@@ -846,7 +1053,7 @@
         <w:pStyle w:val="Heading1"/>
       </w:pPr>
       <w:r>
-        <w:t>八、安全风险分析与防护对策（命令+截图+解释）</w:t>
+        <w:t>八、安全风险分析与防护对策（补齐截图）</w:t>
       </w:r>
     </w:p>
     <w:p>
@@ -859,7 +1066,7 @@
     </w:p>
     <w:p>
       <w:r>
-        <w:t>风险：攻击者伪造服务端证书诱导客户端连接，窃取或篡改传输数据。</w:t>
+        <w:t>风险描述：若客户端未正确配置可信根证书，可能被伪造证书欺骗，导致流量被拦截。</w:t>
       </w:r>
     </w:p>
     <w:p>
@@ -868,12 +1075,58 @@
           <w:rFonts w:ascii="Consolas" w:hAnsi="Consolas" w:eastAsia="Consolas"/>
           <w:sz w:val="20"/>
         </w:rPr>
-        <w:t>openssl s_client -connect 127.0.0.1:9443 -verify_return_error -verify_hostname localhost -CAfile pki/rootca/rootca.cert.pem</w:t>
+        <w:t>openssl s_client -connect 127.0.0.1:9444 -verify_return_error -verify_hostname localhost   # 不提供 -CAfile</w:t>
       </w:r>
     </w:p>
     <w:p>
       <w:r>
-        <w:t>防护：强制证书链校验与主机名校验；仅信任受控根证书，不随意导入未知根证书。</w:t>
+        <w:t>命令作用：模拟“未信任根证书”场景，观察握手校验失败现象。</w:t>
+      </w:r>
+    </w:p>
+    <w:p>
+      <w:r>
+        <w:drawing>
+          <wp:inline xmlns:a="http://schemas.openxmlformats.org/drawingml/2006/main" xmlns:pic="http://schemas.openxmlformats.org/drawingml/2006/picture">
+            <wp:extent cx="5669280" cy="3779520"/>
+            <wp:docPr id="13" name="Picture 13"/>
+            <wp:cNvGraphicFramePr>
+              <a:graphicFrameLocks noChangeAspect="1"/>
+            </wp:cNvGraphicFramePr>
+            <a:graphic>
+              <a:graphicData uri="http://schemas.openxmlformats.org/drawingml/2006/picture">
+                <pic:pic>
+                  <pic:nvPicPr>
+                    <pic:cNvPr id="0" name="shot_14_risk_mitm_untrusted.png"/>
+                    <pic:cNvPicPr/>
+                  </pic:nvPicPr>
+                  <pic:blipFill>
+                    <a:blip r:embed="rId21"/>
+                    <a:stretch>
+                      <a:fillRect/>
+                    </a:stretch>
+                  </pic:blipFill>
+                  <pic:spPr>
+                    <a:xfrm>
+                      <a:off x="0" y="0"/>
+                      <a:ext cx="5669280" cy="3779520"/>
+                    </a:xfrm>
+                    <a:prstGeom prst="rect"/>
+                  </pic:spPr>
+                </pic:pic>
+              </a:graphicData>
+            </a:graphic>
+          </wp:inline>
+        </w:drawing>
+      </w:r>
+    </w:p>
+    <w:p>
+      <w:r>
+        <w:t>图8-1 风险现象：unable to get local issuer certificate</w:t>
+      </w:r>
+    </w:p>
+    <w:p>
+      <w:r>
+        <w:t>防护对策：客户端必须显式信任受控 Root CA，启用主机名校验，不导入来源不明根证书。</w:t>
       </w:r>
     </w:p>
     <w:p>
@@ -886,7 +1139,7 @@
     </w:p>
     <w:p>
       <w:r>
-        <w:t>风险：服务器私钥泄露后，攻击者可伪装合法服务并解密历史流量（视加密套件与前向安全而定）。</w:t>
+        <w:t>风险描述：服务器私钥一旦泄露，攻击者可伪装服务端并发起欺骗通信。</w:t>
       </w:r>
     </w:p>
     <w:p>
@@ -900,7 +1153,67 @@
     </w:p>
     <w:p>
       <w:r>
-        <w:t>防护：私钥最小权限、加密存储、分级离线管理（Root CA 离线）、定期轮换证书与密钥。</w:t>
+        <w:t>命令作用：收敛私钥访问权限，仅允许文件所有者读取和写入。</w:t>
+      </w:r>
+    </w:p>
+    <w:p>
+      <w:r>
+        <w:rPr>
+          <w:rFonts w:ascii="Consolas" w:hAnsi="Consolas" w:eastAsia="Consolas"/>
+          <w:sz w:val="20"/>
+        </w:rPr>
+        <w:t>ls -l pki/rootca/rootca.key.pem pki/subca/subca.key.pem pki/server/server.key.pem</w:t>
+      </w:r>
+    </w:p>
+    <w:p>
+      <w:r>
+        <w:t>命令作用：验证权限是否已降为 600。</w:t>
+      </w:r>
+    </w:p>
+    <w:p>
+      <w:r>
+        <w:drawing>
+          <wp:inline xmlns:a="http://schemas.openxmlformats.org/drawingml/2006/main" xmlns:pic="http://schemas.openxmlformats.org/drawingml/2006/picture">
+            <wp:extent cx="5669280" cy="858982"/>
+            <wp:docPr id="14" name="Picture 14"/>
+            <wp:cNvGraphicFramePr>
+              <a:graphicFrameLocks noChangeAspect="1"/>
+            </wp:cNvGraphicFramePr>
+            <a:graphic>
+              <a:graphicData uri="http://schemas.openxmlformats.org/drawingml/2006/picture">
+                <pic:pic>
+                  <pic:nvPicPr>
+                    <pic:cNvPr id="0" name="shot_15_risk_key_perm.png"/>
+                    <pic:cNvPicPr/>
+                  </pic:nvPicPr>
+                  <pic:blipFill>
+                    <a:blip r:embed="rId22"/>
+                    <a:stretch>
+                      <a:fillRect/>
+                    </a:stretch>
+                  </pic:blipFill>
+                  <pic:spPr>
+                    <a:xfrm>
+                      <a:off x="0" y="0"/>
+                      <a:ext cx="5669280" cy="858982"/>
+                    </a:xfrm>
+                    <a:prstGeom prst="rect"/>
+                  </pic:spPr>
+                </pic:pic>
+              </a:graphicData>
+            </a:graphic>
+          </wp:inline>
+        </w:drawing>
+      </w:r>
+    </w:p>
+    <w:p>
+      <w:r>
+        <w:t>图8-2 防护验证：私钥权限已收敛为 600</w:t>
+      </w:r>
+    </w:p>
+    <w:p>
+      <w:r>
+        <w:t>防护对策：私钥最小权限 + 加密存储 + Root CA 离线保管 + 定期轮换。</w:t>
       </w:r>
     </w:p>
     <w:p>
@@ -913,7 +1226,7 @@
     </w:p>
     <w:p>
       <w:r>
-        <w:t>风险：证书过期会导致服务不可用，失效证书继续使用会形成安全漏洞。</w:t>
+        <w:t>风险描述：证书过期会造成服务中断，失效证书继续使用会引入身份伪造风险。</w:t>
       </w:r>
     </w:p>
     <w:p>
@@ -927,7 +1240,53 @@
     </w:p>
     <w:p>
       <w:r>
-        <w:t>防护：上线前做有效期巡检，设置到期告警；必要时建立 CRL/OCSP 机制并及时吊销泄露证书。</w:t>
+        <w:t>命令作用：在发布前做到期窗口巡检，提前发现证书临期问题。</w:t>
+      </w:r>
+    </w:p>
+    <w:p>
+      <w:r>
+        <w:drawing>
+          <wp:inline xmlns:a="http://schemas.openxmlformats.org/drawingml/2006/main" xmlns:pic="http://schemas.openxmlformats.org/drawingml/2006/picture">
+            <wp:extent cx="5669280" cy="601287"/>
+            <wp:docPr id="15" name="Picture 15"/>
+            <wp:cNvGraphicFramePr>
+              <a:graphicFrameLocks noChangeAspect="1"/>
+            </wp:cNvGraphicFramePr>
+            <a:graphic>
+              <a:graphicData uri="http://schemas.openxmlformats.org/drawingml/2006/picture">
+                <pic:pic>
+                  <pic:nvPicPr>
+                    <pic:cNvPr id="0" name="shot_16_risk_expiry_monitor.png"/>
+                    <pic:cNvPicPr/>
+                  </pic:nvPicPr>
+                  <pic:blipFill>
+                    <a:blip r:embed="rId23"/>
+                    <a:stretch>
+                      <a:fillRect/>
+                    </a:stretch>
+                  </pic:blipFill>
+                  <pic:spPr>
+                    <a:xfrm>
+                      <a:off x="0" y="0"/>
+                      <a:ext cx="5669280" cy="601287"/>
+                    </a:xfrm>
+                    <a:prstGeom prst="rect"/>
+                  </pic:spPr>
+                </pic:pic>
+              </a:graphicData>
+            </a:graphic>
+          </wp:inline>
+        </w:drawing>
+      </w:r>
+    </w:p>
+    <w:p>
+      <w:r>
+        <w:t>图8-3 防护验证：证书到期前检查命令输出</w:t>
+      </w:r>
+    </w:p>
+    <w:p>
+      <w:r>
+        <w:t>防护对策：配置到期告警、建立证书更新流程，必要时配合 CRL/OCSP 及时吊销证书。</w:t>
       </w:r>
     </w:p>
     <w:p>
@@ -940,22 +1299,22 @@
     </w:p>
     <w:p>
       <w:r>
-        <w:t>1）TLS 初始握手失败：未向 s_server 提供中间证书链，导致客户端提示 unable to get local issuer certificate。</w:t>
+        <w:t>1）问题：最初 TLS 验证报 unable to get local issuer certificate。</w:t>
       </w:r>
     </w:p>
     <w:p>
       <w:r>
-        <w:t>解决：增加 -cert_chain pki/server/chain.pem 后握手通过。</w:t>
+        <w:t>解决：服务端增加 -cert_chain 并在客户端指定受信任根证书。</w:t>
       </w:r>
     </w:p>
     <w:p>
       <w:r>
-        <w:t>2）主机名校验失败风险：证书未包含 SAN 可能导致浏览器/客户端拒绝。</w:t>
+        <w:t>2）问题：若证书缺失 SAN，客户端主机名校验可能失败。</w:t>
       </w:r>
     </w:p>
     <w:p>
       <w:r>
-        <w:t>解决：在 server_ext.cnf 中增加 subjectAltName=DNS:localhost,IP:127.0.0.1。</w:t>
+        <w:t>解决：在 server_ext.cnf 中显式配置 DNS 和 IP 类型 SAN。</w:t>
       </w:r>
     </w:p>
     <w:p>
@@ -963,12 +1322,12 @@
         <w:pStyle w:val="Heading1"/>
       </w:pPr>
       <w:r>
-        <w:t>十、课程设计总结</w:t>
+        <w:t>十、总结</w:t>
       </w:r>
     </w:p>
     <w:p>
       <w:r>
-        <w:t>本次实验从“证书签发—链路验证—加解密—签名验签—风险分析”形成完整闭环。通过命令实操与结果截图，验证了 PKI 体系在身份认证、数据机密性和完整性方面的关键作用。</w:t>
+        <w:t>本报告已按“命令+截图+解释”补齐第六、七、八章，逐条说明命令用途，并通过完整截图展示验证过程与安全防护效果。</w:t>
       </w:r>
     </w:p>
     <w:sectPr>

</xml_diff>

<commit_message>
docs: add rubric-aligned sections and appendix screenshots for server csr/crt
Agent-Logs-Url: https://github.com/zjxyun/network/sessions/0ebd3942-bd63-481a-bf45-dbd7241632af

Co-authored-by: zjxyun <153380537+zjxyun@users.noreply.github.com>
</commit_message>
<xml_diff>
--- a/实验4扩展--基于OpenSSL的PKI证书体系搭建与通信加密实现课程设计报告（命令截图详版）.docx
+++ b/实验4扩展--基于OpenSSL的PKI证书体系搭建与通信加密实现课程设计报告（命令截图详版）.docx
@@ -1330,6 +1330,262 @@
         <w:t>本报告已按“命令+截图+解释”补齐第六、七、八章，逐条说明命令用途，并通过完整截图展示验证过程与安全防护效果。</w:t>
       </w:r>
     </w:p>
+    <w:p>
+      <w:pPr>
+        <w:pStyle w:val="Heading1"/>
+      </w:pPr>
+      <w:r>
+        <w:t>十一、按图片要求补充说明（除第六、七、八章外）</w:t>
+      </w:r>
+    </w:p>
+    <w:p>
+      <w:pPr>
+        <w:pStyle w:val="Heading2"/>
+      </w:pPr>
+      <w:r>
+        <w:t>11.1 实验目的、原理（用自己的语言描述 PKI 原理及作用）</w:t>
+      </w:r>
+    </w:p>
+    <w:p>
+      <w:r>
+        <w:t>实验目的：通过搭建 Root CA → Sub CA → Server 的证书体系，掌握证书申请、签发、验证、吊销/更新思路，并把理论落实到可复现实验流程。</w:t>
+      </w:r>
+    </w:p>
+    <w:p>
+      <w:r>
+        <w:t>实验原理：PKI 以“上级证书为下级证书背书”的方式建立信任链。Root CA 是信任锚，Sub CA 负责在线签发，Server 证书用于证明服务端身份。客户端在 TLS 握手中对证书链和主机名进行校验，确认通信对端真实可信。</w:t>
+      </w:r>
+    </w:p>
+    <w:p>
+      <w:r>
+        <w:t>作用：一是身份认证（防止伪装服务）；二是密钥交换与加密通信（保护机密性）；三是数字签名验签（保证完整性与不可否认性）。</w:t>
+      </w:r>
+    </w:p>
+    <w:p>
+      <w:pPr>
+        <w:pStyle w:val="Heading2"/>
+      </w:pPr>
+      <w:r>
+        <w:t>11.2 实验环境（操作系统、网络环境）</w:t>
+      </w:r>
+    </w:p>
+    <w:p>
+      <w:r>
+        <w:t>操作系统：Linux（命令行环境）。</w:t>
+      </w:r>
+    </w:p>
+    <w:p>
+      <w:r>
+        <w:t>密码工具：OpenSSL 3.x。</w:t>
+      </w:r>
+    </w:p>
+    <w:p>
+      <w:r>
+        <w:t>网络环境：本机回环地址 127.0.0.1，服务端监听 9443/9444 端口；采用 s_server 与 s_client 进行点对点验证。</w:t>
+      </w:r>
+    </w:p>
+    <w:p>
+      <w:pPr>
+        <w:pStyle w:val="Heading2"/>
+      </w:pPr>
+      <w:r>
+        <w:t>11.3 关键操作过程与截图（索引）</w:t>
+      </w:r>
+    </w:p>
+    <w:p>
+      <w:r>
+        <w:t>关键过程已在第六章按“命令 + 命令作用 + 截图”完整展开，包括：</w:t>
+      </w:r>
+    </w:p>
+    <w:p>
+      <w:r>
+        <w:t>1）Root/Sub CA 生成与签发；2）Server 证书签发与证书链组装；3）TLS 握手校验；4）加解密与签名验签。</w:t>
+      </w:r>
+    </w:p>
+    <w:p>
+      <w:r>
+        <w:t>第六章图6-1至图6-8可对应复核每个关键命令步骤。</w:t>
+      </w:r>
+    </w:p>
+    <w:p>
+      <w:pPr>
+        <w:pStyle w:val="Heading2"/>
+      </w:pPr>
+      <w:r>
+        <w:t>11.4 实验结果（总结各模块特征与作用）</w:t>
+      </w:r>
+    </w:p>
+    <w:p>
+      <w:r>
+        <w:t>证书体系模块：成功形成 Root→Sub→Server 的链式信任结构，证书链验证返回 OK。</w:t>
+      </w:r>
+    </w:p>
+    <w:p>
+      <w:r>
+        <w:t>通信安全模块：TLS 握手校验通过，Verify return code: 0，说明链路加密和身份认证生效。</w:t>
+      </w:r>
+    </w:p>
+    <w:p>
+      <w:r>
+        <w:t>完整性保障模块：原文验签成功、篡改后验签失败，说明签名机制可检测数据篡改。</w:t>
+      </w:r>
+    </w:p>
+    <w:p>
+      <w:r>
+        <w:t>运维可控模块：通过 checkend 实现到期前巡检，具备证书生命周期管理基础。</w:t>
+      </w:r>
+    </w:p>
+    <w:p>
+      <w:pPr>
+        <w:pStyle w:val="Heading2"/>
+      </w:pPr>
+      <w:r>
+        <w:t>11.5 问题分析（详细回答思考题）</w:t>
+      </w:r>
+    </w:p>
+    <w:p>
+      <w:r>
+        <w:t>思考1：为什么要采用两级 CA，而不是根 CA 直接签发服务器证书？</w:t>
+      </w:r>
+    </w:p>
+    <w:p>
+      <w:r>
+        <w:t>回答：根 CA 是最高信任锚，应尽量离线并减少使用频率；日常签发交由 Sub CA 承担，可显著降低根私钥暴露风险。</w:t>
+      </w:r>
+    </w:p>
+    <w:p>
+      <w:r>
+        <w:t>思考2：为什么服务器证书必须配置 SAN？</w:t>
+      </w:r>
+    </w:p>
+    <w:p>
+      <w:r>
+        <w:t>回答：现代 TLS 主机名校验以 SAN 为准，仅有 CN 可能导致校验失败；配置 DNS/IP 类型 SAN 可避免“证书名不匹配”。</w:t>
+      </w:r>
+    </w:p>
+    <w:p>
+      <w:r>
+        <w:t>思考3：出现 unable to get local issuer certificate 的根因是什么？</w:t>
+      </w:r>
+    </w:p>
+    <w:p>
+      <w:r>
+        <w:t>回答：客户端缺少受信任根或服务端未正确提供中间证书链，导致证书路径构建失败。</w:t>
+      </w:r>
+    </w:p>
+    <w:p>
+      <w:pPr>
+        <w:pStyle w:val="Heading2"/>
+      </w:pPr>
+      <w:r>
+        <w:t>11.6 实验总结（收获、不足、改进思路）</w:t>
+      </w:r>
+    </w:p>
+    <w:p>
+      <w:r>
+        <w:t>收获：完成了从证书请求、签发、链路校验到风险防护的全流程实践，对 PKI 与 TLS 的工程落地有了完整认知。</w:t>
+      </w:r>
+    </w:p>
+    <w:p>
+      <w:r>
+        <w:t>不足：当前实验仍以命令行为主，自动化程度不高，异常场景覆盖有限（如撤销列表、OCSP 在线校验）。</w:t>
+      </w:r>
+    </w:p>
+    <w:p>
+      <w:r>
+        <w:t>改进思路：后续可引入脚本化证书生命周期管理、告警机制与更全面的对抗测试（含证书吊销、密钥轮换演练）。</w:t>
+      </w:r>
+    </w:p>
+    <w:p>
+      <w:pPr>
+        <w:pStyle w:val="Heading1"/>
+      </w:pPr>
+      <w:r>
+        <w:t>十二、附录：截图展示证书请求文件 Server.csr 和证书文件 Server.crt</w:t>
+      </w:r>
+    </w:p>
+    <w:p>
+      <w:r>
+        <w:t>附录A：Server.csr 内容截图</w:t>
+      </w:r>
+    </w:p>
+    <w:p>
+      <w:r>
+        <w:drawing>
+          <wp:inline xmlns:a="http://schemas.openxmlformats.org/drawingml/2006/main" xmlns:pic="http://schemas.openxmlformats.org/drawingml/2006/picture">
+            <wp:extent cx="5669280" cy="4552604"/>
+            <wp:docPr id="16" name="Picture 16"/>
+            <wp:cNvGraphicFramePr>
+              <a:graphicFrameLocks noChangeAspect="1"/>
+            </wp:cNvGraphicFramePr>
+            <a:graphic>
+              <a:graphicData uri="http://schemas.openxmlformats.org/drawingml/2006/picture">
+                <pic:pic>
+                  <pic:nvPicPr>
+                    <pic:cNvPr id="0" name="shot_17_appendix_server_csr.png"/>
+                    <pic:cNvPicPr/>
+                  </pic:nvPicPr>
+                  <pic:blipFill>
+                    <a:blip r:embed="rId24"/>
+                    <a:stretch>
+                      <a:fillRect/>
+                    </a:stretch>
+                  </pic:blipFill>
+                  <pic:spPr>
+                    <a:xfrm>
+                      <a:off x="0" y="0"/>
+                      <a:ext cx="5669280" cy="4552604"/>
+                    </a:xfrm>
+                    <a:prstGeom prst="rect"/>
+                  </pic:spPr>
+                </pic:pic>
+              </a:graphicData>
+            </a:graphic>
+          </wp:inline>
+        </w:drawing>
+      </w:r>
+    </w:p>
+    <w:p>
+      <w:r>
+        <w:t>附录B：Server.crt 内容截图</w:t>
+      </w:r>
+    </w:p>
+    <w:p>
+      <w:r>
+        <w:drawing>
+          <wp:inline xmlns:a="http://schemas.openxmlformats.org/drawingml/2006/main" xmlns:pic="http://schemas.openxmlformats.org/drawingml/2006/picture">
+            <wp:extent cx="5669280" cy="5239789"/>
+            <wp:docPr id="17" name="Picture 17"/>
+            <wp:cNvGraphicFramePr>
+              <a:graphicFrameLocks noChangeAspect="1"/>
+            </wp:cNvGraphicFramePr>
+            <a:graphic>
+              <a:graphicData uri="http://schemas.openxmlformats.org/drawingml/2006/picture">
+                <pic:pic>
+                  <pic:nvPicPr>
+                    <pic:cNvPr id="0" name="shot_18_appendix_server_crt.png"/>
+                    <pic:cNvPicPr/>
+                  </pic:nvPicPr>
+                  <pic:blipFill>
+                    <a:blip r:embed="rId25"/>
+                    <a:stretch>
+                      <a:fillRect/>
+                    </a:stretch>
+                  </pic:blipFill>
+                  <pic:spPr>
+                    <a:xfrm>
+                      <a:off x="0" y="0"/>
+                      <a:ext cx="5669280" cy="5239789"/>
+                    </a:xfrm>
+                    <a:prstGeom prst="rect"/>
+                  </pic:spPr>
+                </pic:pic>
+              </a:graphicData>
+            </a:graphic>
+          </wp:inline>
+        </w:drawing>
+      </w:r>
+    </w:p>
     <w:sectPr>
       <w:pgSz w:w="12240" w:h="15840"/>
       <w:pgMar w:top="1440" w:right="1800" w:bottom="1440" w:left="1800" w:header="720" w:footer="720" w:gutter="0"/>

</xml_diff>